<commit_message>
Table S17 log2FC direction, S18 module descriptions, S2 normalization note
- Table_Legends.md: S17 log2FC clarified as log2(C/P); S18 module column
  documented with color-ambiguity caveat and module_description field; S2
  normalized_ratio noted as not protein-abundance-corrected
- Table S18.csv: added module_description column for all 11 network/module
  combinations
- Table_Legends.docx: regenerated from updated markdown

Co-Authored-By: Claude Sonnet 4.6 <noreply@anthropic.com>
</commit_message>
<xml_diff>
--- a/Final_Supplemental_Tables/Table_Legends.docx
+++ b/Final_Supplemental_Tables/Table_Legends.docx
@@ -613,13 +613,59 @@
         <w:t xml:space="preserve"> </w:t>
       </w:r>
       <w:r>
-        <w:t xml:space="preserve">normalized SILAC ratio relative to the common mid-log spike-in reference.</w:t>
-      </w:r>
-      <w:r>
-        <w:t xml:space="preserve"> </w:t>
-      </w:r>
-      <w:r>
-        <w:t xml:space="preserve">242,688 rows total.</w:t>
+        <w:t xml:space="preserve">MaxQuant-normalized SILAC ratio of the phosphopeptide relative to the common</w:t>
+      </w:r>
+      <w:r>
+        <w:t xml:space="preserve"> </w:t>
+      </w:r>
+      <w:r>
+        <w:t xml:space="preserve">mid-log spike-in reference (WT or rim15KO channel / spike-in). This ratio</w:t>
+      </w:r>
+      <w:r>
+        <w:t xml:space="preserve"> </w:t>
+      </w:r>
+      <w:r>
+        <w:t xml:space="preserve">reflects phosphopeptide abundance and is</w:t>
+      </w:r>
+      <w:r>
+        <w:t xml:space="preserve"> </w:t>
+      </w:r>
+      <w:r>
+        <w:rPr>
+          <w:b/>
+          <w:bCs/>
+        </w:rPr>
+        <w:t xml:space="preserve">not</w:t>
+      </w:r>
+      <w:r>
+        <w:t xml:space="preserve"> </w:t>
+      </w:r>
+      <w:r>
+        <w:t xml:space="preserve">corrected for changes in total</w:t>
+      </w:r>
+      <w:r>
+        <w:t xml:space="preserve"> </w:t>
+      </w:r>
+      <w:r>
+        <w:t xml:space="preserve">protein abundance; it therefore conflates changes in phosphorylation</w:t>
+      </w:r>
+      <w:r>
+        <w:t xml:space="preserve"> </w:t>
+      </w:r>
+      <w:r>
+        <w:t xml:space="preserve">stoichiometry with changes in protein level. To isolate occupancy changes,</w:t>
+      </w:r>
+      <w:r>
+        <w:t xml:space="preserve"> </w:t>
+      </w:r>
+      <w:r>
+        <w:t xml:space="preserve">subtract the corresponding protein log2FC (Table S16) from the phosphosite</w:t>
+      </w:r>
+      <w:r>
+        <w:t xml:space="preserve"> </w:t>
+      </w:r>
+      <w:r>
+        <w:t xml:space="preserve">log2FC. 242,688 rows total.</w:t>
       </w:r>
     </w:p>
     <w:p>
@@ -3278,7 +3324,7 @@
         <w:t xml:space="preserve"> </w:t>
       </w:r>
       <w:r>
-        <w:t xml:space="preserve">— log2 fold change between nutrient conditions.</w:t>
+        <w:t xml:space="preserve">— log2 fold change (carbon / phosphorus), i.e. log₂[mean(C) / mean(P)]; positive values indicate higher abundance in carbon starvation.</w:t>
       </w:r>
     </w:p>
     <w:p>
@@ -3442,7 +3488,47 @@
         <w:t xml:space="preserve"> </w:t>
       </w:r>
       <w:r>
-        <w:t xml:space="preserve">module label;</w:t>
+        <w:t xml:space="preserve">module label (arbitrary WGCNA color identifier; same color in different</w:t>
+      </w:r>
+      <w:r>
+        <w:t xml:space="preserve"> </w:t>
+      </w:r>
+      <w:r>
+        <w:t xml:space="preserve">networks reflects different biology);</w:t>
+      </w:r>
+      <w:r>
+        <w:t xml:space="preserve"> </w:t>
+      </w:r>
+      <w:r>
+        <w:rPr>
+          <w:i/>
+          <w:iCs/>
+        </w:rPr>
+        <w:t xml:space="preserve">module_description</w:t>
+      </w:r>
+      <w:r>
+        <w:t xml:space="preserve"> </w:t>
+      </w:r>
+      <w:r>
+        <w:t xml:space="preserve">— plain-language</w:t>
+      </w:r>
+      <w:r>
+        <w:t xml:space="preserve"> </w:t>
+      </w:r>
+      <w:r>
+        <w:t xml:space="preserve">summary of the module’s eigengene trajectory (e.g. </w:t>
+      </w:r>
+      <w:r>
+        <w:t xml:space="preserve">“Upregulated during carbon</w:t>
+      </w:r>
+      <w:r>
+        <w:t xml:space="preserve"> </w:t>
+      </w:r>
+      <w:r>
+        <w:t xml:space="preserve">starvation”</w:t>
+      </w:r>
+      <w:r>
+        <w:t xml:space="preserve">);</w:t>
       </w:r>
       <w:r>
         <w:t xml:space="preserve"> </w:t>

</xml_diff>

<commit_message>
Add R03 proteome comparison and S25/S26 table scaffolding
- revision3/R03_proteome_overlap.Rmd: new script comparing detected and
  quiescence-regulated proteins across this study (Table S5/S16), Paulo et al.
  2015 (si_001/si_003), and den Ridder et al. 2023 (mmc7). Produces
  proteome_coverage.csv (Table S25) and proteome_regulation_overlap.csv
  (Table S26) in revision3/output/. UpSet plots written to same folder.
- make_final_supplemental_tables.R: added S25 and S26 copy steps.
- Table_Legends.md / .docx: added legends for S25 and S26.

Co-Authored-By: Claude Sonnet 4.6 <noreply@anthropic.com>
</commit_message>
<xml_diff>
--- a/Final_Supplemental_Tables/Table_Legends.docx
+++ b/Final_Supplemental_Tables/Table_Legends.docx
@@ -4983,6 +4983,469 @@
       </w:r>
       <w:r>
         <w:t xml:space="preserve">16, 30).</w:t>
+      </w:r>
+    </w:p>
+    <w:p>
+      <w:r>
+        <w:pict>
+          <v:rect style="width:0;height:1.5pt" o:hralign="center" o:hrstd="t" o:hr="t"/>
+        </w:pict>
+      </w:r>
+    </w:p>
+    <w:p>
+      <w:pPr>
+        <w:pStyle w:val="FirstParagraph"/>
+      </w:pPr>
+      <w:r>
+        <w:rPr>
+          <w:b/>
+          <w:bCs/>
+        </w:rPr>
+        <w:t xml:space="preserve">Table S25. Cross-dataset proteome coverage.</w:t>
+      </w:r>
+      <w:r>
+        <w:t xml:space="preserve"> </w:t>
+      </w:r>
+      <w:r>
+        <w:t xml:space="preserve">Binary membership table indicating which proteins were detected in each of</w:t>
+      </w:r>
+      <w:r>
+        <w:t xml:space="preserve"> </w:t>
+      </w:r>
+      <w:r>
+        <w:t xml:space="preserve">three yeast proteomics studies. Generated by</w:t>
+      </w:r>
+      <w:r>
+        <w:t xml:space="preserve"> </w:t>
+      </w:r>
+      <w:r>
+        <w:rPr>
+          <w:rStyle w:val="VerbatimChar"/>
+        </w:rPr>
+        <w:t xml:space="preserve">revision3/R03_proteome_overlap.Rmd</w:t>
+      </w:r>
+      <w:r>
+        <w:t xml:space="preserve">.</w:t>
+      </w:r>
+      <w:r>
+        <w:t xml:space="preserve"> </w:t>
+      </w:r>
+      <w:r>
+        <w:t xml:space="preserve">Source for this study: Table S5 (</w:t>
+      </w:r>
+      <w:r>
+        <w:rPr>
+          <w:rStyle w:val="VerbatimChar"/>
+        </w:rPr>
+        <w:t xml:space="preserve">tables/supplemental/S5_normalized_protein_ratios.csv</w:t>
+      </w:r>
+      <w:r>
+        <w:t xml:space="preserve">).</w:t>
+      </w:r>
+      <w:r>
+        <w:t xml:space="preserve"> </w:t>
+      </w:r>
+      <w:r>
+        <w:t xml:space="preserve">Published datasets: Paulo et al. 2015 (label-free quant of quiescent yeast,</w:t>
+      </w:r>
+      <w:r>
+        <w:t xml:space="preserve"> </w:t>
+      </w:r>
+      <w:r>
+        <w:rPr>
+          <w:rStyle w:val="VerbatimChar"/>
+        </w:rPr>
+        <w:t xml:space="preserve">NIHMS464126-supplement-2_si_001.xlsx</w:t>
+      </w:r>
+      <w:r>
+        <w:t xml:space="preserve">, all detected ORFs) and den Ridder et</w:t>
+      </w:r>
+      <w:r>
+        <w:t xml:space="preserve"> </w:t>
+      </w:r>
+      <w:r>
+        <w:t xml:space="preserve">al. 2023 (TMT proteome of</w:t>
+      </w:r>
+      <w:r>
+        <w:t xml:space="preserve"> </w:t>
+      </w:r>
+      <w:r>
+        <w:rPr>
+          <w:i/>
+          <w:iCs/>
+        </w:rPr>
+        <w:t xml:space="preserve">S. cerevisiae</w:t>
+      </w:r>
+      <w:r>
+        <w:t xml:space="preserve"> </w:t>
+      </w:r>
+      <w:r>
+        <w:t xml:space="preserve">under aerobic/anaerobic conditions,</w:t>
+      </w:r>
+      <w:r>
+        <w:t xml:space="preserve"> </w:t>
+      </w:r>
+      <w:r>
+        <w:rPr>
+          <w:rStyle w:val="VerbatimChar"/>
+        </w:rPr>
+        <w:t xml:space="preserve">mmc7.xlsx</w:t>
+      </w:r>
+      <w:r>
+        <w:t xml:space="preserve">; included for coverage comparison only, not a quiescence study).</w:t>
+      </w:r>
+      <w:r>
+        <w:t xml:space="preserve"> </w:t>
+      </w:r>
+      <w:r>
+        <w:t xml:space="preserve">Columns:</w:t>
+      </w:r>
+      <w:r>
+        <w:t xml:space="preserve"> </w:t>
+      </w:r>
+      <w:r>
+        <w:rPr>
+          <w:i/>
+          <w:iCs/>
+        </w:rPr>
+        <w:t xml:space="preserve">orf</w:t>
+      </w:r>
+      <w:r>
+        <w:t xml:space="preserve"> </w:t>
+      </w:r>
+      <w:r>
+        <w:t xml:space="preserve">— SGD systematic ORF name;</w:t>
+      </w:r>
+      <w:r>
+        <w:t xml:space="preserve"> </w:t>
+      </w:r>
+      <w:r>
+        <w:rPr>
+          <w:i/>
+          <w:iCs/>
+        </w:rPr>
+        <w:t xml:space="preserve">gene</w:t>
+      </w:r>
+      <w:r>
+        <w:t xml:space="preserve"> </w:t>
+      </w:r>
+      <w:r>
+        <w:t xml:space="preserve">— standard gene name (from</w:t>
+      </w:r>
+      <w:r>
+        <w:t xml:space="preserve"> </w:t>
+      </w:r>
+      <w:r>
+        <w:t xml:space="preserve">this study where available);</w:t>
+      </w:r>
+      <w:r>
+        <w:t xml:space="preserve"> </w:t>
+      </w:r>
+      <w:r>
+        <w:rPr>
+          <w:i/>
+          <w:iCs/>
+        </w:rPr>
+        <w:t xml:space="preserve">ThisStudy</w:t>
+      </w:r>
+      <w:r>
+        <w:t xml:space="preserve"> </w:t>
+      </w:r>
+      <w:r>
+        <w:t xml:space="preserve">— 1 if detected in this study,</w:t>
+      </w:r>
+      <w:r>
+        <w:t xml:space="preserve"> </w:t>
+      </w:r>
+      <w:r>
+        <w:t xml:space="preserve">0 otherwise;</w:t>
+      </w:r>
+      <w:r>
+        <w:t xml:space="preserve"> </w:t>
+      </w:r>
+      <w:r>
+        <w:rPr>
+          <w:i/>
+          <w:iCs/>
+        </w:rPr>
+        <w:t xml:space="preserve">Paulo2015</w:t>
+      </w:r>
+      <w:r>
+        <w:t xml:space="preserve"> </w:t>
+      </w:r>
+      <w:r>
+        <w:t xml:space="preserve">— 1 if detected by Paulo et al. 2015, 0 otherwise;</w:t>
+      </w:r>
+      <w:r>
+        <w:t xml:space="preserve"> </w:t>
+      </w:r>
+      <w:r>
+        <w:rPr>
+          <w:i/>
+          <w:iCs/>
+        </w:rPr>
+        <w:t xml:space="preserve">denRidder2023</w:t>
+      </w:r>
+      <w:r>
+        <w:t xml:space="preserve"> </w:t>
+      </w:r>
+      <w:r>
+        <w:t xml:space="preserve">— 1 if detected by den Ridder et al. 2023, 0 otherwise.</w:t>
+      </w:r>
+    </w:p>
+    <w:p>
+      <w:r>
+        <w:pict>
+          <v:rect style="width:0;height:1.5pt" o:hralign="center" o:hrstd="t" o:hr="t"/>
+        </w:pict>
+      </w:r>
+    </w:p>
+    <w:p>
+      <w:pPr>
+        <w:pStyle w:val="FirstParagraph"/>
+      </w:pPr>
+      <w:r>
+        <w:rPr>
+          <w:b/>
+          <w:bCs/>
+        </w:rPr>
+        <w:t xml:space="preserve">Table S26. Quiescence-regulation protein overlap.</w:t>
+      </w:r>
+      <w:r>
+        <w:t xml:space="preserve"> </w:t>
+      </w:r>
+      <w:r>
+        <w:t xml:space="preserve">Binary membership and category assignment comparing rim15Δ-regulated proteins</w:t>
+      </w:r>
+      <w:r>
+        <w:t xml:space="preserve"> </w:t>
+      </w:r>
+      <w:r>
+        <w:t xml:space="preserve">from this study with quiescent-enriched proteins from Paulo et al. 2015.</w:t>
+      </w:r>
+      <w:r>
+        <w:t xml:space="preserve"> </w:t>
+      </w:r>
+      <w:r>
+        <w:t xml:space="preserve">Generated by</w:t>
+      </w:r>
+      <w:r>
+        <w:t xml:space="preserve"> </w:t>
+      </w:r>
+      <w:r>
+        <w:rPr>
+          <w:rStyle w:val="VerbatimChar"/>
+        </w:rPr>
+        <w:t xml:space="preserve">revision3/R03_proteome_overlap.Rmd</w:t>
+      </w:r>
+      <w:r>
+        <w:t xml:space="preserve">. Source for this study:</w:t>
+      </w:r>
+      <w:r>
+        <w:t xml:space="preserve"> </w:t>
+      </w:r>
+      <w:r>
+        <w:t xml:space="preserve">Table S16 (</w:t>
+      </w:r>
+      <w:r>
+        <w:rPr>
+          <w:rStyle w:val="VerbatimChar"/>
+        </w:rPr>
+        <w:t xml:space="preserve">tables/DE_proteins_byGenotype.csv</w:t>
+      </w:r>
+      <w:r>
+        <w:t xml:space="preserve">, q ≤ 0.05 in any contrast).</w:t>
+      </w:r>
+      <w:r>
+        <w:t xml:space="preserve"> </w:t>
+      </w:r>
+      <w:r>
+        <w:t xml:space="preserve">Published data: Paulo et al. 2015</w:t>
+      </w:r>
+      <w:r>
+        <w:t xml:space="preserve"> </w:t>
+      </w:r>
+      <w:r>
+        <w:rPr>
+          <w:rStyle w:val="VerbatimChar"/>
+        </w:rPr>
+        <w:t xml:space="preserve">NIHMS464126-supplement-3_si_003.xlsx</w:t>
+      </w:r>
+      <w:r>
+        <w:t xml:space="preserve"> </w:t>
+      </w:r>
+      <w:r>
+        <w:t xml:space="preserve">sheet</w:t>
+      </w:r>
+      <w:r>
+        <w:t xml:space="preserve"> </w:t>
+      </w:r>
+      <w:r>
+        <w:t xml:space="preserve">“2X or more Up in Quiescent”</w:t>
+      </w:r>
+      <w:r>
+        <w:t xml:space="preserve"> </w:t>
+      </w:r>
+      <w:r>
+        <w:t xml:space="preserve">(proteins ≥2-fold enriched in quiescent</w:t>
+      </w:r>
+      <w:r>
+        <w:t xml:space="preserve"> </w:t>
+      </w:r>
+      <w:r>
+        <w:t xml:space="preserve">vs upper-fraction cells). Columns:</w:t>
+      </w:r>
+      <w:r>
+        <w:t xml:space="preserve"> </w:t>
+      </w:r>
+      <w:r>
+        <w:rPr>
+          <w:i/>
+          <w:iCs/>
+        </w:rPr>
+        <w:t xml:space="preserve">orf</w:t>
+      </w:r>
+      <w:r>
+        <w:t xml:space="preserve"> </w:t>
+      </w:r>
+      <w:r>
+        <w:t xml:space="preserve">— SGD systematic ORF name;</w:t>
+      </w:r>
+      <w:r>
+        <w:t xml:space="preserve"> </w:t>
+      </w:r>
+      <w:r>
+        <w:rPr>
+          <w:i/>
+          <w:iCs/>
+        </w:rPr>
+        <w:t xml:space="preserve">gene</w:t>
+      </w:r>
+      <w:r>
+        <w:t xml:space="preserve"> </w:t>
+      </w:r>
+      <w:r>
+        <w:t xml:space="preserve">—</w:t>
+      </w:r>
+      <w:r>
+        <w:t xml:space="preserve"> </w:t>
+      </w:r>
+      <w:r>
+        <w:t xml:space="preserve">standard gene name;</w:t>
+      </w:r>
+      <w:r>
+        <w:t xml:space="preserve"> </w:t>
+      </w:r>
+      <w:r>
+        <w:rPr>
+          <w:i/>
+          <w:iCs/>
+        </w:rPr>
+        <w:t xml:space="preserve">ThisStudy_rim15reg</w:t>
+      </w:r>
+      <w:r>
+        <w:t xml:space="preserve"> </w:t>
+      </w:r>
+      <w:r>
+        <w:t xml:space="preserve">— 1 if significantly regulated in</w:t>
+      </w:r>
+      <w:r>
+        <w:t xml:space="preserve"> </w:t>
+      </w:r>
+      <w:r>
+        <w:t xml:space="preserve">rim15Δ (q ≤ 0.05), 0 otherwise;</w:t>
+      </w:r>
+      <w:r>
+        <w:t xml:space="preserve"> </w:t>
+      </w:r>
+      <w:r>
+        <w:rPr>
+          <w:i/>
+          <w:iCs/>
+        </w:rPr>
+        <w:t xml:space="preserve">Paulo2015_qsnt</w:t>
+      </w:r>
+      <w:r>
+        <w:t xml:space="preserve"> </w:t>
+      </w:r>
+      <w:r>
+        <w:t xml:space="preserve">— 1 if ≥2-fold enriched in</w:t>
+      </w:r>
+      <w:r>
+        <w:t xml:space="preserve"> </w:t>
+      </w:r>
+      <w:r>
+        <w:t xml:space="preserve">Paulo 2015 quiescent fraction, 0 otherwise;</w:t>
+      </w:r>
+      <w:r>
+        <w:t xml:space="preserve"> </w:t>
+      </w:r>
+      <w:r>
+        <w:rPr>
+          <w:i/>
+          <w:iCs/>
+        </w:rPr>
+        <w:t xml:space="preserve">category</w:t>
+      </w:r>
+      <w:r>
+        <w:t xml:space="preserve"> </w:t>
+      </w:r>
+      <w:r>
+        <w:t xml:space="preserve">—</w:t>
+      </w:r>
+      <w:r>
+        <w:t xml:space="preserve"> </w:t>
+      </w:r>
+      <w:r>
+        <w:t xml:space="preserve">“shared”</w:t>
+      </w:r>
+      <w:r>
+        <w:t xml:space="preserve"> </w:t>
+      </w:r>
+      <w:r>
+        <w:t xml:space="preserve">(in both</w:t>
+      </w:r>
+      <w:r>
+        <w:t xml:space="preserve"> </w:t>
+      </w:r>
+      <w:r>
+        <w:t xml:space="preserve">sets),</w:t>
+      </w:r>
+      <w:r>
+        <w:t xml:space="preserve"> </w:t>
+      </w:r>
+      <w:r>
+        <w:t xml:space="preserve">“novel_this_study”</w:t>
+      </w:r>
+      <w:r>
+        <w:t xml:space="preserve"> </w:t>
+      </w:r>
+      <w:r>
+        <w:t xml:space="preserve">(rim15Δ-regulated but not in Paulo quiescent set),</w:t>
+      </w:r>
+      <w:r>
+        <w:t xml:space="preserve"> </w:t>
+      </w:r>
+      <w:r>
+        <w:t xml:space="preserve">or</w:t>
+      </w:r>
+      <w:r>
+        <w:t xml:space="preserve"> </w:t>
+      </w:r>
+      <w:r>
+        <w:t xml:space="preserve">“paulo_only”</w:t>
+      </w:r>
+      <w:r>
+        <w:t xml:space="preserve"> </w:t>
+      </w:r>
+      <w:r>
+        <w:t xml:space="preserve">(Paulo quiescent-enriched but not rim15Δ-regulated in this</w:t>
+      </w:r>
+      <w:r>
+        <w:t xml:space="preserve"> </w:t>
+      </w:r>
+      <w:r>
+        <w:t xml:space="preserve">study).</w:t>
       </w:r>
     </w:p>
     <w:bookmarkEnd w:id="9"/>

</xml_diff>

<commit_message>
Revise R03: compare WT starvation FC vs Paulo quiescence proteome
Replace rim15Δ-vs-WT comparison with WT log2FC at T30/T00 in C and N
starvation (|log2FC| > 1, matching Paulo 2015 threshold). Four-set UpSet:
ThisStudy_up, ThisStudy_down, Paulo_q_up, Paulo_log_up. Update S26 legend.

Co-Authored-By: Claude Sonnet 4.6 <noreply@anthropic.com>
</commit_message>
<xml_diff>
--- a/Final_Supplemental_Tables/Table_Legends.docx
+++ b/Final_Supplemental_Tables/Table_Legends.docx
@@ -5209,25 +5209,25 @@
           <w:b/>
           <w:bCs/>
         </w:rPr>
-        <w:t xml:space="preserve">Table S26. Quiescence-regulation protein overlap.</w:t>
-      </w:r>
-      <w:r>
-        <w:t xml:space="preserve"> </w:t>
-      </w:r>
-      <w:r>
-        <w:t xml:space="preserve">Binary membership and category assignment comparing rim15Δ-regulated proteins</w:t>
-      </w:r>
-      <w:r>
-        <w:t xml:space="preserve"> </w:t>
-      </w:r>
-      <w:r>
-        <w:t xml:space="preserve">from this study with quiescent-enriched proteins from Paulo et al. 2015.</w:t>
-      </w:r>
-      <w:r>
-        <w:t xml:space="preserve"> </w:t>
-      </w:r>
-      <w:r>
-        <w:t xml:space="preserve">Generated by</w:t>
+        <w:t xml:space="preserve">Table S26. Starvation-regulation protein overlap (this study vs Paulo et al. 2015).</w:t>
+      </w:r>
+      <w:r>
+        <w:t xml:space="preserve"> </w:t>
+      </w:r>
+      <w:r>
+        <w:t xml:space="preserve">Binary membership table comparing proteins regulated during quiescence entry</w:t>
+      </w:r>
+      <w:r>
+        <w:t xml:space="preserve"> </w:t>
+      </w:r>
+      <w:r>
+        <w:t xml:space="preserve">in this study with those differentially abundant between quiescent and</w:t>
+      </w:r>
+      <w:r>
+        <w:t xml:space="preserve"> </w:t>
+      </w:r>
+      <w:r>
+        <w:t xml:space="preserve">log-phase cells in Paulo et al. 2015. Generated by</w:t>
       </w:r>
       <w:r>
         <w:t xml:space="preserve"> </w:t>
@@ -5239,28 +5239,40 @@
         <w:t xml:space="preserve">revision3/R03_proteome_overlap.Rmd</w:t>
       </w:r>
       <w:r>
-        <w:t xml:space="preserve">. Source for this study:</w:t>
-      </w:r>
-      <w:r>
-        <w:t xml:space="preserve"> </w:t>
-      </w:r>
-      <w:r>
-        <w:t xml:space="preserve">Table S16 (</w:t>
+        <w:t xml:space="preserve">. Source for this study: Table S5</w:t>
+      </w:r>
+      <w:r>
+        <w:t xml:space="preserve"> </w:t>
+      </w:r>
+      <w:r>
+        <w:t xml:space="preserve">(</w:t>
       </w:r>
       <w:r>
         <w:rPr>
           <w:rStyle w:val="VerbatimChar"/>
         </w:rPr>
-        <w:t xml:space="preserve">tables/DE_proteins_byGenotype.csv</w:t>
-      </w:r>
-      <w:r>
-        <w:t xml:space="preserve">, q ≤ 0.05 in any contrast).</w:t>
-      </w:r>
-      <w:r>
-        <w:t xml:space="preserve"> </w:t>
-      </w:r>
-      <w:r>
-        <w:t xml:space="preserve">Published data: Paulo et al. 2015</w:t>
+        <w:t xml:space="preserve">tables/supplemental/S5_normalized_protein_ratios.csv</w:t>
+      </w:r>
+      <w:r>
+        <w:t xml:space="preserve">); WT log₂ fold</w:t>
+      </w:r>
+      <w:r>
+        <w:t xml:space="preserve"> </w:t>
+      </w:r>
+      <w:r>
+        <w:t xml:space="preserve">change at 30 h vs 0 h computed separately for carbon and nitrogen starvation;</w:t>
+      </w:r>
+      <w:r>
+        <w:t xml:space="preserve"> </w:t>
+      </w:r>
+      <w:r>
+        <w:t xml:space="preserve">threshold |log₂FC| ≥ 1 (≥2-fold), matching Paulo et al. 2015. Published</w:t>
+      </w:r>
+      <w:r>
+        <w:t xml:space="preserve"> </w:t>
+      </w:r>
+      <w:r>
+        <w:t xml:space="preserve">data: Paulo et al. 2015</w:t>
       </w:r>
       <w:r>
         <w:t xml:space="preserve"> </w:t>
@@ -5275,25 +5287,49 @@
         <w:t xml:space="preserve"> </w:t>
       </w:r>
       <w:r>
-        <w:t xml:space="preserve">sheet</w:t>
-      </w:r>
-      <w:r>
-        <w:t xml:space="preserve"> </w:t>
-      </w:r>
-      <w:r>
-        <w:t xml:space="preserve">“2X or more Up in Quiescent”</w:t>
-      </w:r>
-      <w:r>
-        <w:t xml:space="preserve"> </w:t>
-      </w:r>
-      <w:r>
-        <w:t xml:space="preserve">(proteins ≥2-fold enriched in quiescent</w:t>
-      </w:r>
-      <w:r>
-        <w:t xml:space="preserve"> </w:t>
-      </w:r>
-      <w:r>
-        <w:t xml:space="preserve">vs upper-fraction cells). Columns:</w:t>
+        <w:t xml:space="preserve">sheets</w:t>
+      </w:r>
+      <w:r>
+        <w:t xml:space="preserve"> </w:t>
+      </w:r>
+      <w:r>
+        <w:t xml:space="preserve">“2X or</w:t>
+      </w:r>
+      <w:r>
+        <w:t xml:space="preserve"> </w:t>
+      </w:r>
+      <w:r>
+        <w:t xml:space="preserve">more Up in Quiescent”</w:t>
+      </w:r>
+      <w:r>
+        <w:t xml:space="preserve"> </w:t>
+      </w:r>
+      <w:r>
+        <w:t xml:space="preserve">(235 proteins enriched in quiescent cells) and</w:t>
+      </w:r>
+      <w:r>
+        <w:t xml:space="preserve"> </w:t>
+      </w:r>
+      <w:r>
+        <w:t xml:space="preserve">“2X or</w:t>
+      </w:r>
+      <w:r>
+        <w:t xml:space="preserve"> </w:t>
+      </w:r>
+      <w:r>
+        <w:t xml:space="preserve">more Up in LOG”</w:t>
+      </w:r>
+      <w:r>
+        <w:t xml:space="preserve"> </w:t>
+      </w:r>
+      <w:r>
+        <w:t xml:space="preserve">(332 proteins enriched in log-phase, i.e. decreasing during</w:t>
+      </w:r>
+      <w:r>
+        <w:t xml:space="preserve"> </w:t>
+      </w:r>
+      <w:r>
+        <w:t xml:space="preserve">quiescence). Columns:</w:t>
       </w:r>
       <w:r>
         <w:t xml:space="preserve"> </w:t>
@@ -5325,127 +5361,101 @@
         <w:t xml:space="preserve"> </w:t>
       </w:r>
       <w:r>
-        <w:t xml:space="preserve">—</w:t>
-      </w:r>
-      <w:r>
-        <w:t xml:space="preserve"> </w:t>
-      </w:r>
-      <w:r>
-        <w:t xml:space="preserve">standard gene name;</w:t>
-      </w:r>
-      <w:r>
-        <w:t xml:space="preserve"> </w:t>
-      </w:r>
-      <w:r>
-        <w:rPr>
-          <w:i/>
-          <w:iCs/>
-        </w:rPr>
-        <w:t xml:space="preserve">ThisStudy_rim15reg</w:t>
-      </w:r>
-      <w:r>
-        <w:t xml:space="preserve"> </w:t>
-      </w:r>
-      <w:r>
-        <w:t xml:space="preserve">— 1 if significantly regulated in</w:t>
-      </w:r>
-      <w:r>
-        <w:t xml:space="preserve"> </w:t>
-      </w:r>
-      <w:r>
-        <w:t xml:space="preserve">rim15Δ (q ≤ 0.05), 0 otherwise;</w:t>
-      </w:r>
-      <w:r>
-        <w:t xml:space="preserve"> </w:t>
-      </w:r>
-      <w:r>
-        <w:rPr>
-          <w:i/>
-          <w:iCs/>
-        </w:rPr>
-        <w:t xml:space="preserve">Paulo2015_qsnt</w:t>
-      </w:r>
-      <w:r>
-        <w:t xml:space="preserve"> </w:t>
-      </w:r>
-      <w:r>
-        <w:t xml:space="preserve">— 1 if ≥2-fold enriched in</w:t>
-      </w:r>
-      <w:r>
-        <w:t xml:space="preserve"> </w:t>
-      </w:r>
-      <w:r>
-        <w:t xml:space="preserve">Paulo 2015 quiescent fraction, 0 otherwise;</w:t>
-      </w:r>
-      <w:r>
-        <w:t xml:space="preserve"> </w:t>
-      </w:r>
-      <w:r>
-        <w:rPr>
-          <w:i/>
-          <w:iCs/>
-        </w:rPr>
-        <w:t xml:space="preserve">category</w:t>
-      </w:r>
-      <w:r>
-        <w:t xml:space="preserve"> </w:t>
-      </w:r>
-      <w:r>
-        <w:t xml:space="preserve">—</w:t>
-      </w:r>
-      <w:r>
-        <w:t xml:space="preserve"> </w:t>
-      </w:r>
-      <w:r>
-        <w:t xml:space="preserve">“shared”</w:t>
-      </w:r>
-      <w:r>
-        <w:t xml:space="preserve"> </w:t>
-      </w:r>
-      <w:r>
-        <w:t xml:space="preserve">(in both</w:t>
-      </w:r>
-      <w:r>
-        <w:t xml:space="preserve"> </w:t>
-      </w:r>
-      <w:r>
-        <w:t xml:space="preserve">sets),</w:t>
-      </w:r>
-      <w:r>
-        <w:t xml:space="preserve"> </w:t>
-      </w:r>
-      <w:r>
-        <w:t xml:space="preserve">“novel_this_study”</w:t>
-      </w:r>
-      <w:r>
-        <w:t xml:space="preserve"> </w:t>
-      </w:r>
-      <w:r>
-        <w:t xml:space="preserve">(rim15Δ-regulated but not in Paulo quiescent set),</w:t>
-      </w:r>
-      <w:r>
-        <w:t xml:space="preserve"> </w:t>
-      </w:r>
-      <w:r>
-        <w:t xml:space="preserve">or</w:t>
-      </w:r>
-      <w:r>
-        <w:t xml:space="preserve"> </w:t>
-      </w:r>
-      <w:r>
-        <w:t xml:space="preserve">“paulo_only”</w:t>
-      </w:r>
-      <w:r>
-        <w:t xml:space="preserve"> </w:t>
-      </w:r>
-      <w:r>
-        <w:t xml:space="preserve">(Paulo quiescent-enriched but not rim15Δ-regulated in this</w:t>
-      </w:r>
-      <w:r>
-        <w:t xml:space="preserve"> </w:t>
-      </w:r>
-      <w:r>
-        <w:t xml:space="preserve">study).</w:t>
+        <w:t xml:space="preserve">— standard gene</w:t>
+      </w:r>
+      <w:r>
+        <w:t xml:space="preserve"> </w:t>
+      </w:r>
+      <w:r>
+        <w:t xml:space="preserve">name;</w:t>
+      </w:r>
+      <w:r>
+        <w:t xml:space="preserve"> </w:t>
+      </w:r>
+      <w:r>
+        <w:rPr>
+          <w:i/>
+          <w:iCs/>
+        </w:rPr>
+        <w:t xml:space="preserve">ThisStudy_up</w:t>
+      </w:r>
+      <w:r>
+        <w:t xml:space="preserve"> </w:t>
+      </w:r>
+      <w:r>
+        <w:t xml:space="preserve">— 1 if ≥2-fold upregulated at T30 in WT (C or N</w:t>
+      </w:r>
+      <w:r>
+        <w:t xml:space="preserve"> </w:t>
+      </w:r>
+      <w:r>
+        <w:t xml:space="preserve">starvation), 0 otherwise;</w:t>
+      </w:r>
+      <w:r>
+        <w:t xml:space="preserve"> </w:t>
+      </w:r>
+      <w:r>
+        <w:rPr>
+          <w:i/>
+          <w:iCs/>
+        </w:rPr>
+        <w:t xml:space="preserve">ThisStudy_down</w:t>
+      </w:r>
+      <w:r>
+        <w:t xml:space="preserve"> </w:t>
+      </w:r>
+      <w:r>
+        <w:t xml:space="preserve">— 1 if ≥2-fold downregulated at</w:t>
+      </w:r>
+      <w:r>
+        <w:t xml:space="preserve"> </w:t>
+      </w:r>
+      <w:r>
+        <w:t xml:space="preserve">T30 in WT (C or N starvation), 0 otherwise;</w:t>
+      </w:r>
+      <w:r>
+        <w:t xml:space="preserve"> </w:t>
+      </w:r>
+      <w:r>
+        <w:rPr>
+          <w:i/>
+          <w:iCs/>
+        </w:rPr>
+        <w:t xml:space="preserve">Paulo_q_up</w:t>
+      </w:r>
+      <w:r>
+        <w:t xml:space="preserve"> </w:t>
+      </w:r>
+      <w:r>
+        <w:t xml:space="preserve">— 1 if ≥2-fold</w:t>
+      </w:r>
+      <w:r>
+        <w:t xml:space="preserve"> </w:t>
+      </w:r>
+      <w:r>
+        <w:t xml:space="preserve">enriched in Paulo 2015 quiescent fraction;</w:t>
+      </w:r>
+      <w:r>
+        <w:t xml:space="preserve"> </w:t>
+      </w:r>
+      <w:r>
+        <w:rPr>
+          <w:i/>
+          <w:iCs/>
+        </w:rPr>
+        <w:t xml:space="preserve">Paulo_log_up</w:t>
+      </w:r>
+      <w:r>
+        <w:t xml:space="preserve"> </w:t>
+      </w:r>
+      <w:r>
+        <w:t xml:space="preserve">— 1 if ≥2-fold</w:t>
+      </w:r>
+      <w:r>
+        <w:t xml:space="preserve"> </w:t>
+      </w:r>
+      <w:r>
+        <w:t xml:space="preserve">enriched in Paulo 2015 log-phase (i.e. decreasing in quiescence).</w:t>
       </w:r>
     </w:p>
     <w:bookmarkEnd w:id="9"/>

</xml_diff>

<commit_message>
Simplify R03: C starvation only, Paulo 2015 only, add summary paragraph
Focus comparison on WT carbon starvation vs Paulo 2015 quiescence proteome.
Drop den Ridder and N starvation. Add results='asis' paragraph block that
auto-fills numbers from the analysis for the reviewer response. Update S26
legend accordingly.

Co-Authored-By: Claude Sonnet 4.6 <noreply@anthropic.com>
</commit_message>
<xml_diff>
--- a/Final_Supplemental_Tables/Table_Legends.docx
+++ b/Final_Supplemental_Tables/Table_Legends.docx
@@ -5209,25 +5209,25 @@
           <w:b/>
           <w:bCs/>
         </w:rPr>
-        <w:t xml:space="preserve">Table S26. Starvation-regulation protein overlap (this study vs Paulo et al. 2015).</w:t>
-      </w:r>
-      <w:r>
-        <w:t xml:space="preserve"> </w:t>
-      </w:r>
-      <w:r>
-        <w:t xml:space="preserve">Binary membership table comparing proteins regulated during quiescence entry</w:t>
-      </w:r>
-      <w:r>
-        <w:t xml:space="preserve"> </w:t>
-      </w:r>
-      <w:r>
-        <w:t xml:space="preserve">in this study with those differentially abundant between quiescent and</w:t>
-      </w:r>
-      <w:r>
-        <w:t xml:space="preserve"> </w:t>
-      </w:r>
-      <w:r>
-        <w:t xml:space="preserve">log-phase cells in Paulo et al. 2015. Generated by</w:t>
+        <w:t xml:space="preserve">Table S26. Carbon starvation protein regulation overlap (this study vs Paulo et al. 2015).</w:t>
+      </w:r>
+      <w:r>
+        <w:t xml:space="preserve"> </w:t>
+      </w:r>
+      <w:r>
+        <w:t xml:space="preserve">Binary membership table comparing proteins regulated during carbon starvation</w:t>
+      </w:r>
+      <w:r>
+        <w:t xml:space="preserve"> </w:t>
+      </w:r>
+      <w:r>
+        <w:t xml:space="preserve">in WT cells (this study) with those differentially abundant between quiescent</w:t>
+      </w:r>
+      <w:r>
+        <w:t xml:space="preserve"> </w:t>
+      </w:r>
+      <w:r>
+        <w:t xml:space="preserve">and log-phase cells in Paulo et al. 2015. Generated by</w:t>
       </w:r>
       <w:r>
         <w:t xml:space="preserve"> </w:t>
@@ -5260,19 +5260,13 @@
         <w:t xml:space="preserve"> </w:t>
       </w:r>
       <w:r>
-        <w:t xml:space="preserve">change at 30 h vs 0 h computed separately for carbon and nitrogen starvation;</w:t>
-      </w:r>
-      <w:r>
-        <w:t xml:space="preserve"> </w:t>
-      </w:r>
-      <w:r>
-        <w:t xml:space="preserve">threshold |log₂FC| ≥ 1 (≥2-fold), matching Paulo et al. 2015. Published</w:t>
-      </w:r>
-      <w:r>
-        <w:t xml:space="preserve"> </w:t>
-      </w:r>
-      <w:r>
-        <w:t xml:space="preserve">data: Paulo et al. 2015</w:t>
+        <w:t xml:space="preserve">change at 30 h vs 0 h in carbon starvation; threshold |log₂FC| ≥ 1 (≥2-fold),</w:t>
+      </w:r>
+      <w:r>
+        <w:t xml:space="preserve"> </w:t>
+      </w:r>
+      <w:r>
+        <w:t xml:space="preserve">matching Paulo et al. 2015. Published data: Paulo et al. 2015</w:t>
       </w:r>
       <w:r>
         <w:t xml:space="preserve"> </w:t>
@@ -5293,43 +5287,31 @@
         <w:t xml:space="preserve"> </w:t>
       </w:r>
       <w:r>
-        <w:t xml:space="preserve">“2X or</w:t>
-      </w:r>
-      <w:r>
-        <w:t xml:space="preserve"> </w:t>
-      </w:r>
-      <w:r>
-        <w:t xml:space="preserve">more Up in Quiescent”</w:t>
-      </w:r>
-      <w:r>
-        <w:t xml:space="preserve"> </w:t>
-      </w:r>
-      <w:r>
-        <w:t xml:space="preserve">(235 proteins enriched in quiescent cells) and</w:t>
-      </w:r>
-      <w:r>
-        <w:t xml:space="preserve"> </w:t>
-      </w:r>
-      <w:r>
-        <w:t xml:space="preserve">“2X or</w:t>
-      </w:r>
-      <w:r>
-        <w:t xml:space="preserve"> </w:t>
-      </w:r>
-      <w:r>
-        <w:t xml:space="preserve">more Up in LOG”</w:t>
-      </w:r>
-      <w:r>
-        <w:t xml:space="preserve"> </w:t>
-      </w:r>
-      <w:r>
-        <w:t xml:space="preserve">(332 proteins enriched in log-phase, i.e. decreasing during</w:t>
-      </w:r>
-      <w:r>
-        <w:t xml:space="preserve"> </w:t>
-      </w:r>
-      <w:r>
-        <w:t xml:space="preserve">quiescence). Columns:</w:t>
+        <w:t xml:space="preserve">“2X or more Up in Quiescent”</w:t>
+      </w:r>
+      <w:r>
+        <w:t xml:space="preserve"> </w:t>
+      </w:r>
+      <w:r>
+        <w:t xml:space="preserve">(proteins enriched in quiescent cells) and</w:t>
+      </w:r>
+      <w:r>
+        <w:t xml:space="preserve"> </w:t>
+      </w:r>
+      <w:r>
+        <w:t xml:space="preserve">“2X or more Up in LOG”</w:t>
+      </w:r>
+      <w:r>
+        <w:t xml:space="preserve"> </w:t>
+      </w:r>
+      <w:r>
+        <w:t xml:space="preserve">(proteins</w:t>
+      </w:r>
+      <w:r>
+        <w:t xml:space="preserve"> </w:t>
+      </w:r>
+      <w:r>
+        <w:t xml:space="preserve">enriched in log-phase, i.e. decreasing during quiescence entry). Columns:</w:t>
       </w:r>
       <w:r>
         <w:t xml:space="preserve"> </w:t>
@@ -5361,13 +5343,7 @@
         <w:t xml:space="preserve"> </w:t>
       </w:r>
       <w:r>
-        <w:t xml:space="preserve">— standard gene</w:t>
-      </w:r>
-      <w:r>
-        <w:t xml:space="preserve"> </w:t>
-      </w:r>
-      <w:r>
-        <w:t xml:space="preserve">name;</w:t>
+        <w:t xml:space="preserve">— standard gene name;</w:t>
       </w:r>
       <w:r>
         <w:t xml:space="preserve"> </w:t>
@@ -5383,13 +5359,7 @@
         <w:t xml:space="preserve"> </w:t>
       </w:r>
       <w:r>
-        <w:t xml:space="preserve">— 1 if ≥2-fold upregulated at T30 in WT (C or N</w:t>
-      </w:r>
-      <w:r>
-        <w:t xml:space="preserve"> </w:t>
-      </w:r>
-      <w:r>
-        <w:t xml:space="preserve">starvation), 0 otherwise;</w:t>
+        <w:t xml:space="preserve">— 1 if ≥2-fold upregulated at T30 in WT carbon starvation, 0 otherwise;</w:t>
       </w:r>
       <w:r>
         <w:t xml:space="preserve"> </w:t>
@@ -5405,13 +5375,13 @@
         <w:t xml:space="preserve"> </w:t>
       </w:r>
       <w:r>
-        <w:t xml:space="preserve">— 1 if ≥2-fold downregulated at</w:t>
-      </w:r>
-      <w:r>
-        <w:t xml:space="preserve"> </w:t>
-      </w:r>
-      <w:r>
-        <w:t xml:space="preserve">T30 in WT (C or N starvation), 0 otherwise;</w:t>
+        <w:t xml:space="preserve">— 1 if ≥2-fold downregulated at T30 in WT carbon starvation,</w:t>
+      </w:r>
+      <w:r>
+        <w:t xml:space="preserve"> </w:t>
+      </w:r>
+      <w:r>
+        <w:t xml:space="preserve">0 otherwise;</w:t>
       </w:r>
       <w:r>
         <w:t xml:space="preserve"> </w:t>
@@ -5427,13 +5397,13 @@
         <w:t xml:space="preserve"> </w:t>
       </w:r>
       <w:r>
-        <w:t xml:space="preserve">— 1 if ≥2-fold</w:t>
-      </w:r>
-      <w:r>
-        <w:t xml:space="preserve"> </w:t>
-      </w:r>
-      <w:r>
-        <w:t xml:space="preserve">enriched in Paulo 2015 quiescent fraction;</w:t>
+        <w:t xml:space="preserve">— 1 if ≥2-fold enriched in Paulo 2015 quiescent</w:t>
+      </w:r>
+      <w:r>
+        <w:t xml:space="preserve"> </w:t>
+      </w:r>
+      <w:r>
+        <w:t xml:space="preserve">fraction;</w:t>
       </w:r>
       <w:r>
         <w:t xml:space="preserve"> </w:t>
@@ -5449,13 +5419,7 @@
         <w:t xml:space="preserve"> </w:t>
       </w:r>
       <w:r>
-        <w:t xml:space="preserve">— 1 if ≥2-fold</w:t>
-      </w:r>
-      <w:r>
-        <w:t xml:space="preserve"> </w:t>
-      </w:r>
-      <w:r>
-        <w:t xml:space="preserve">enriched in Paulo 2015 log-phase (i.e. decreasing in quiescence).</w:t>
+        <w:t xml:space="preserve">— 1 if ≥2-fold enriched in Paulo 2015 log-phase.</w:t>
       </w:r>
     </w:p>
     <w:bookmarkEnd w:id="9"/>

</xml_diff>

<commit_message>
R02/R03: add quantitative overlap tables, GO enrichment, and S27/S28 legends
- R02: carry pSite through ours_sites; add log2fc_Li2019 to li_sites;
  carry log2fc_Plank/pval_Plank from plank_sig through plank_sites;
  add quantitative_overlap chunk writing phosphosite_overlap_quantitative.csv
  (our sig sites ∩ ≥1 published dataset, with side-by-side fold changes)
- R03: add overlap_detailed chunk writing proteome_overlap_detailed.csv
  (all proteins detected in both studies, with our log2FC + Paulo ratio/p-value);
  add go_enrichment chunk (hypergeometric test via org.Sc.sgd.db + GO.db)
  writing go_up_overlap.csv and go_down_overlap.csv for doubly-regulated sets
- make_final_supplemental_tables.R: add S27 (proteome overlap detailed) and
  S28 (phosphosite overlap quantitative) copy steps
- Table_Legends.md/.docx: add legends for S27 and S28

Co-Authored-By: Claude Sonnet 4.6 <noreply@anthropic.com>
</commit_message>
<xml_diff>
--- a/Final_Supplemental_Tables/Table_Legends.docx
+++ b/Final_Supplemental_Tables/Table_Legends.docx
@@ -5420,6 +5420,660 @@
       </w:r>
       <w:r>
         <w:t xml:space="preserve">— 1 if ≥2-fold enriched in Paulo 2015 log-phase.</w:t>
+      </w:r>
+    </w:p>
+    <w:p>
+      <w:r>
+        <w:pict>
+          <v:rect style="width:0;height:1.5pt" o:hralign="center" o:hrstd="t" o:hr="t"/>
+        </w:pict>
+      </w:r>
+    </w:p>
+    <w:p>
+      <w:pPr>
+        <w:pStyle w:val="FirstParagraph"/>
+      </w:pPr>
+      <w:r>
+        <w:rPr>
+          <w:b/>
+          <w:bCs/>
+        </w:rPr>
+        <w:t xml:space="preserve">Table S27. Proteome overlap: quantitative comparison between this study and Paulo et al. 2015.</w:t>
+      </w:r>
+      <w:r>
+        <w:t xml:space="preserve"> </w:t>
+      </w:r>
+      <w:r>
+        <w:t xml:space="preserve">Side-by-side quantitative comparison for all proteins detected in both this</w:t>
+      </w:r>
+      <w:r>
+        <w:t xml:space="preserve"> </w:t>
+      </w:r>
+      <w:r>
+        <w:t xml:space="preserve">study and Paulo et al. 2015, enabling direct fold-change comparison across</w:t>
+      </w:r>
+      <w:r>
+        <w:t xml:space="preserve"> </w:t>
+      </w:r>
+      <w:r>
+        <w:t xml:space="preserve">independent experimental approaches. Generated by</w:t>
+      </w:r>
+      <w:r>
+        <w:t xml:space="preserve"> </w:t>
+      </w:r>
+      <w:r>
+        <w:rPr>
+          <w:rStyle w:val="VerbatimChar"/>
+        </w:rPr>
+        <w:t xml:space="preserve">revision3/R03_proteome_overlap.Rmd</w:t>
+      </w:r>
+      <w:r>
+        <w:t xml:space="preserve">.</w:t>
+      </w:r>
+      <w:r>
+        <w:t xml:space="preserve"> </w:t>
+      </w:r>
+      <w:r>
+        <w:t xml:space="preserve">Universe: all 989 proteins detected by both studies in carbon starvation</w:t>
+      </w:r>
+      <w:r>
+        <w:t xml:space="preserve"> </w:t>
+      </w:r>
+      <w:r>
+        <w:t xml:space="preserve">experiments. Columns:</w:t>
+      </w:r>
+      <w:r>
+        <w:t xml:space="preserve"> </w:t>
+      </w:r>
+      <w:r>
+        <w:rPr>
+          <w:i/>
+          <w:iCs/>
+        </w:rPr>
+        <w:t xml:space="preserve">orf</w:t>
+      </w:r>
+      <w:r>
+        <w:t xml:space="preserve"> </w:t>
+      </w:r>
+      <w:r>
+        <w:t xml:space="preserve">— SGD systematic ORF name;</w:t>
+      </w:r>
+      <w:r>
+        <w:t xml:space="preserve"> </w:t>
+      </w:r>
+      <w:r>
+        <w:rPr>
+          <w:i/>
+          <w:iCs/>
+        </w:rPr>
+        <w:t xml:space="preserve">gene</w:t>
+      </w:r>
+      <w:r>
+        <w:t xml:space="preserve"> </w:t>
+      </w:r>
+      <w:r>
+        <w:t xml:space="preserve">— standard</w:t>
+      </w:r>
+      <w:r>
+        <w:t xml:space="preserve"> </w:t>
+      </w:r>
+      <w:r>
+        <w:t xml:space="preserve">gene name;</w:t>
+      </w:r>
+      <w:r>
+        <w:t xml:space="preserve"> </w:t>
+      </w:r>
+      <w:r>
+        <w:rPr>
+          <w:i/>
+          <w:iCs/>
+        </w:rPr>
+        <w:t xml:space="preserve">log2FC_thisStudy</w:t>
+      </w:r>
+      <w:r>
+        <w:t xml:space="preserve"> </w:t>
+      </w:r>
+      <w:r>
+        <w:t xml:space="preserve">— log₂ fold change in this study (WT T30 vs T00,</w:t>
+      </w:r>
+      <w:r>
+        <w:t xml:space="preserve"> </w:t>
+      </w:r>
+      <w:r>
+        <w:t xml:space="preserve">carbon starvation);</w:t>
+      </w:r>
+      <w:r>
+        <w:t xml:space="preserve"> </w:t>
+      </w:r>
+      <w:r>
+        <w:rPr>
+          <w:i/>
+          <w:iCs/>
+        </w:rPr>
+        <w:t xml:space="preserve">paulo_category</w:t>
+      </w:r>
+      <w:r>
+        <w:t xml:space="preserve"> </w:t>
+      </w:r>
+      <w:r>
+        <w:t xml:space="preserve">— classification of the protein in Paulo</w:t>
+      </w:r>
+      <w:r>
+        <w:t xml:space="preserve"> </w:t>
+      </w:r>
+      <w:r>
+        <w:t xml:space="preserve">et al. 2015: quiescent_enriched (≥2-fold up in quiescent cells),</w:t>
+      </w:r>
+      <w:r>
+        <w:t xml:space="preserve"> </w:t>
+      </w:r>
+      <w:r>
+        <w:t xml:space="preserve">log_enriched (≥2-fold up in log-phase cells, i.e. decreasing during quiescence),</w:t>
+      </w:r>
+      <w:r>
+        <w:t xml:space="preserve"> </w:t>
+      </w:r>
+      <w:r>
+        <w:t xml:space="preserve">or detected_only (detected but below the 2-fold threshold in Paulo 2015);</w:t>
+      </w:r>
+      <w:r>
+        <w:t xml:space="preserve"> </w:t>
+      </w:r>
+      <w:r>
+        <w:rPr>
+          <w:i/>
+          <w:iCs/>
+        </w:rPr>
+        <w:t xml:space="preserve">log2FC_Paulo</w:t>
+      </w:r>
+      <w:r>
+        <w:t xml:space="preserve"> </w:t>
+      </w:r>
+      <w:r>
+        <w:t xml:space="preserve">— normalized spectral-count log₂ ratio from Paulo et al. 2015</w:t>
+      </w:r>
+      <w:r>
+        <w:t xml:space="preserve"> </w:t>
+      </w:r>
+      <w:r>
+        <w:t xml:space="preserve">(Q-dense fraction / log-phase; positive values indicate higher abundance in</w:t>
+      </w:r>
+      <w:r>
+        <w:t xml:space="preserve"> </w:t>
+      </w:r>
+      <w:r>
+        <w:t xml:space="preserve">quiescent cells; NA for proteins with insufficient spectral counts in one</w:t>
+      </w:r>
+      <w:r>
+        <w:t xml:space="preserve"> </w:t>
+      </w:r>
+      <w:r>
+        <w:t xml:space="preserve">condition);</w:t>
+      </w:r>
+      <w:r>
+        <w:t xml:space="preserve"> </w:t>
+      </w:r>
+      <w:r>
+        <w:rPr>
+          <w:i/>
+          <w:iCs/>
+        </w:rPr>
+        <w:t xml:space="preserve">paulo_pvalue</w:t>
+      </w:r>
+      <w:r>
+        <w:t xml:space="preserve"> </w:t>
+      </w:r>
+      <w:r>
+        <w:t xml:space="preserve">— ANOVA p-value across fractions from Paulo et al.</w:t>
+      </w:r>
+      <w:r>
+        <w:t xml:space="preserve"> </w:t>
+      </w:r>
+      <w:r>
+        <w:t xml:space="preserve">2015. 989 rows.</w:t>
+      </w:r>
+    </w:p>
+    <w:p>
+      <w:r>
+        <w:pict>
+          <v:rect style="width:0;height:1.5pt" o:hralign="center" o:hrstd="t" o:hr="t"/>
+        </w:pict>
+      </w:r>
+    </w:p>
+    <w:p>
+      <w:pPr>
+        <w:pStyle w:val="FirstParagraph"/>
+      </w:pPr>
+      <w:r>
+        <w:rPr>
+          <w:b/>
+          <w:bCs/>
+        </w:rPr>
+        <w:t xml:space="preserve">Table S28. Phosphosite overlap: quantitative comparison between this study and published datasets.</w:t>
+      </w:r>
+      <w:r>
+        <w:t xml:space="preserve"> </w:t>
+      </w:r>
+      <w:r>
+        <w:t xml:space="preserve">Side-by-side quantitative comparison for Rim15-regulated phosphosites from this</w:t>
+      </w:r>
+      <w:r>
+        <w:t xml:space="preserve"> </w:t>
+      </w:r>
+      <w:r>
+        <w:t xml:space="preserve">study (q ≤ 0.05 in carbon or phosphorus starvation) that are also reported in</w:t>
+      </w:r>
+      <w:r>
+        <w:t xml:space="preserve"> </w:t>
+      </w:r>
+      <w:r>
+        <w:t xml:space="preserve">at least one published Rim15 or PP2A-Cdc55 phosphoproteomic dataset. Enables</w:t>
+      </w:r>
+      <w:r>
+        <w:t xml:space="preserve"> </w:t>
+      </w:r>
+      <w:r>
+        <w:t xml:space="preserve">direct fold-change comparison across studies at the level of individual</w:t>
+      </w:r>
+      <w:r>
+        <w:t xml:space="preserve"> </w:t>
+      </w:r>
+      <w:r>
+        <w:t xml:space="preserve">phosphosites. Generated by</w:t>
+      </w:r>
+      <w:r>
+        <w:t xml:space="preserve"> </w:t>
+      </w:r>
+      <w:r>
+        <w:rPr>
+          <w:rStyle w:val="VerbatimChar"/>
+        </w:rPr>
+        <w:t xml:space="preserve">revision3/R02_phosphosite_overlap.Rmd</w:t>
+      </w:r>
+      <w:r>
+        <w:t xml:space="preserve">. Columns:</w:t>
+      </w:r>
+      <w:r>
+        <w:t xml:space="preserve"> </w:t>
+      </w:r>
+      <w:r>
+        <w:rPr>
+          <w:i/>
+          <w:iCs/>
+        </w:rPr>
+        <w:t xml:space="preserve">key</w:t>
+      </w:r>
+      <w:r>
+        <w:t xml:space="preserve"> </w:t>
+      </w:r>
+      <w:r>
+        <w:t xml:space="preserve">— site identifier (ORF_residueLetter+position, e.g., YNL157W_S64);</w:t>
+      </w:r>
+      <w:r>
+        <w:t xml:space="preserve"> </w:t>
+      </w:r>
+      <w:r>
+        <w:rPr>
+          <w:i/>
+          <w:iCs/>
+        </w:rPr>
+        <w:t xml:space="preserve">orf</w:t>
+      </w:r>
+      <w:r>
+        <w:t xml:space="preserve"> </w:t>
+      </w:r>
+      <w:r>
+        <w:t xml:space="preserve">— SGD systematic ORF name;</w:t>
+      </w:r>
+      <w:r>
+        <w:t xml:space="preserve"> </w:t>
+      </w:r>
+      <w:r>
+        <w:rPr>
+          <w:i/>
+          <w:iCs/>
+        </w:rPr>
+        <w:t xml:space="preserve">gene</w:t>
+      </w:r>
+      <w:r>
+        <w:t xml:space="preserve"> </w:t>
+      </w:r>
+      <w:r>
+        <w:t xml:space="preserve">— standard gene name;</w:t>
+      </w:r>
+      <w:r>
+        <w:t xml:space="preserve"> </w:t>
+      </w:r>
+      <w:r>
+        <w:rPr>
+          <w:i/>
+          <w:iCs/>
+        </w:rPr>
+        <w:t xml:space="preserve">aa</w:t>
+      </w:r>
+      <w:r>
+        <w:t xml:space="preserve"> </w:t>
+      </w:r>
+      <w:r>
+        <w:t xml:space="preserve">—</w:t>
+      </w:r>
+      <w:r>
+        <w:t xml:space="preserve"> </w:t>
+      </w:r>
+      <w:r>
+        <w:t xml:space="preserve">phosphorylated amino acid (S, T, or Y);</w:t>
+      </w:r>
+      <w:r>
+        <w:t xml:space="preserve"> </w:t>
+      </w:r>
+      <w:r>
+        <w:rPr>
+          <w:i/>
+          <w:iCs/>
+        </w:rPr>
+        <w:t xml:space="preserve">position</w:t>
+      </w:r>
+      <w:r>
+        <w:t xml:space="preserve"> </w:t>
+      </w:r>
+      <w:r>
+        <w:t xml:space="preserve">— position in the canonical</w:t>
+      </w:r>
+      <w:r>
+        <w:t xml:space="preserve"> </w:t>
+      </w:r>
+      <w:r>
+        <w:t xml:space="preserve">protein sequence;</w:t>
+      </w:r>
+      <w:r>
+        <w:t xml:space="preserve"> </w:t>
+      </w:r>
+      <w:r>
+        <w:rPr>
+          <w:i/>
+          <w:iCs/>
+        </w:rPr>
+        <w:t xml:space="preserve">log2FC_thisStudy</w:t>
+      </w:r>
+      <w:r>
+        <w:t xml:space="preserve"> </w:t>
+      </w:r>
+      <w:r>
+        <w:t xml:space="preserve">— log₂ fold change from the most</w:t>
+      </w:r>
+      <w:r>
+        <w:t xml:space="preserve"> </w:t>
+      </w:r>
+      <w:r>
+        <w:t xml:space="preserve">significant contrast (WT/rim15Δ) for this site in our dataset;</w:t>
+      </w:r>
+      <w:r>
+        <w:t xml:space="preserve"> </w:t>
+      </w:r>
+      <w:r>
+        <w:rPr>
+          <w:i/>
+          <w:iCs/>
+        </w:rPr>
+        <w:t xml:space="preserve">qvalue_thisStudy</w:t>
+      </w:r>
+      <w:r>
+        <w:t xml:space="preserve"> </w:t>
+      </w:r>
+      <w:r>
+        <w:t xml:space="preserve">— FDR-corrected q-value for that contrast;</w:t>
+      </w:r>
+      <w:r>
+        <w:t xml:space="preserve"> </w:t>
+      </w:r>
+      <w:r>
+        <w:rPr>
+          <w:i/>
+          <w:iCs/>
+        </w:rPr>
+        <w:t xml:space="preserve">nutrient_thisStudy</w:t>
+      </w:r>
+      <w:r>
+        <w:t xml:space="preserve"> </w:t>
+      </w:r>
+      <w:r>
+        <w:t xml:space="preserve">— starvation</w:t>
+      </w:r>
+      <w:r>
+        <w:t xml:space="preserve"> </w:t>
+      </w:r>
+      <w:r>
+        <w:t xml:space="preserve">condition of the most significant contrast (C or P);</w:t>
+      </w:r>
+      <w:r>
+        <w:t xml:space="preserve"> </w:t>
+      </w:r>
+      <w:r>
+        <w:rPr>
+          <w:i/>
+          <w:iCs/>
+        </w:rPr>
+        <w:t xml:space="preserve">time_thisStudy</w:t>
+      </w:r>
+      <w:r>
+        <w:t xml:space="preserve"> </w:t>
+      </w:r>
+      <w:r>
+        <w:t xml:space="preserve">—</w:t>
+      </w:r>
+      <w:r>
+        <w:t xml:space="preserve"> </w:t>
+      </w:r>
+      <w:r>
+        <w:t xml:space="preserve">timepoint of the most significant contrast;</w:t>
+      </w:r>
+      <w:r>
+        <w:t xml:space="preserve"> </w:t>
+      </w:r>
+      <w:r>
+        <w:rPr>
+          <w:i/>
+          <w:iCs/>
+        </w:rPr>
+        <w:t xml:space="preserve">Li2019</w:t>
+      </w:r>
+      <w:r>
+        <w:t xml:space="preserve"> </w:t>
+      </w:r>
+      <w:r>
+        <w:t xml:space="preserve">— 1 if the site appears</w:t>
+      </w:r>
+      <w:r>
+        <w:t xml:space="preserve"> </w:t>
+      </w:r>
+      <w:r>
+        <w:t xml:space="preserve">in Li et al. 2019 (</w:t>
+      </w:r>
+      <w:r>
+        <w:rPr>
+          <w:i/>
+          <w:iCs/>
+        </w:rPr>
+        <w:t xml:space="preserve">rim15Δ</w:t>
+      </w:r>
+      <w:r>
+        <w:t xml:space="preserve">-regulated phosphosites), 0 otherwise;</w:t>
+      </w:r>
+      <w:r>
+        <w:t xml:space="preserve"> </w:t>
+      </w:r>
+      <w:r>
+        <w:rPr>
+          <w:i/>
+          <w:iCs/>
+        </w:rPr>
+        <w:t xml:space="preserve">log2fc_Li2019</w:t>
+      </w:r>
+      <w:r>
+        <w:t xml:space="preserve"> </w:t>
+      </w:r>
+      <w:r>
+        <w:t xml:space="preserve">— log₂ fold change reported by Li et al. 2019 (NA if not in</w:t>
+      </w:r>
+      <w:r>
+        <w:t xml:space="preserve"> </w:t>
+      </w:r>
+      <w:r>
+        <w:t xml:space="preserve">that dataset);</w:t>
+      </w:r>
+      <w:r>
+        <w:t xml:space="preserve"> </w:t>
+      </w:r>
+      <w:r>
+        <w:rPr>
+          <w:i/>
+          <w:iCs/>
+        </w:rPr>
+        <w:t xml:space="preserve">Dokladal2021</w:t>
+      </w:r>
+      <w:r>
+        <w:t xml:space="preserve"> </w:t>
+      </w:r>
+      <w:r>
+        <w:t xml:space="preserve">— 1 if present in Dokladal et al. 2021 (Rim15</w:t>
+      </w:r>
+      <w:r>
+        <w:t xml:space="preserve"> </w:t>
+      </w:r>
+      <w:r>
+        <w:t xml:space="preserve">high-confidence targets), 0 otherwise (no fold-change available);</w:t>
+      </w:r>
+      <w:r>
+        <w:t xml:space="preserve"> </w:t>
+      </w:r>
+      <w:r>
+        <w:rPr>
+          <w:i/>
+          <w:iCs/>
+        </w:rPr>
+        <w:t xml:space="preserve">Baro2018</w:t>
+      </w:r>
+      <w:r>
+        <w:t xml:space="preserve"> </w:t>
+      </w:r>
+      <w:r>
+        <w:t xml:space="preserve">—</w:t>
+      </w:r>
+      <w:r>
+        <w:t xml:space="preserve"> </w:t>
+      </w:r>
+      <w:r>
+        <w:t xml:space="preserve">1 if present in Baro et al. 2018 (PP2A-Cdc55 hyperphosphorylated sites),</w:t>
+      </w:r>
+      <w:r>
+        <w:t xml:space="preserve"> </w:t>
+      </w:r>
+      <w:r>
+        <w:t xml:space="preserve">0 otherwise (no fold-change available);</w:t>
+      </w:r>
+      <w:r>
+        <w:t xml:space="preserve"> </w:t>
+      </w:r>
+      <w:r>
+        <w:rPr>
+          <w:i/>
+          <w:iCs/>
+        </w:rPr>
+        <w:t xml:space="preserve">Plank_Cdc55AID</w:t>
+      </w:r>
+      <w:r>
+        <w:t xml:space="preserve"> </w:t>
+      </w:r>
+      <w:r>
+        <w:t xml:space="preserve">— 1 if present in</w:t>
+      </w:r>
+      <w:r>
+        <w:t xml:space="preserve"> </w:t>
+      </w:r>
+      <w:r>
+        <w:t xml:space="preserve">Plank et al. 2020 (Cdc55 auxin depletion, nominal p ≤ 0.05), 0 otherwise;</w:t>
+      </w:r>
+      <w:r>
+        <w:t xml:space="preserve"> </w:t>
+      </w:r>
+      <w:r>
+        <w:rPr>
+          <w:i/>
+          <w:iCs/>
+        </w:rPr>
+        <w:t xml:space="preserve">log2fc_Plank</w:t>
+      </w:r>
+      <w:r>
+        <w:t xml:space="preserve"> </w:t>
+      </w:r>
+      <w:r>
+        <w:t xml:space="preserve">— log₂ fold change (auxin/mock) from Plank et al. 2020 (NA if</w:t>
+      </w:r>
+      <w:r>
+        <w:t xml:space="preserve"> </w:t>
+      </w:r>
+      <w:r>
+        <w:t xml:space="preserve">not in that dataset);</w:t>
+      </w:r>
+      <w:r>
+        <w:t xml:space="preserve"> </w:t>
+      </w:r>
+      <w:r>
+        <w:rPr>
+          <w:i/>
+          <w:iCs/>
+        </w:rPr>
+        <w:t xml:space="preserve">pval_Plank</w:t>
+      </w:r>
+      <w:r>
+        <w:t xml:space="preserve"> </w:t>
+      </w:r>
+      <w:r>
+        <w:t xml:space="preserve">— nominal p-value from Plank et al. 2020;</w:t>
+      </w:r>
+      <w:r>
+        <w:t xml:space="preserve"> </w:t>
+      </w:r>
+      <w:r>
+        <w:rPr>
+          <w:i/>
+          <w:iCs/>
+        </w:rPr>
+        <w:t xml:space="preserve">n_published</w:t>
+      </w:r>
+      <w:r>
+        <w:t xml:space="preserve"> </w:t>
+      </w:r>
+      <w:r>
+        <w:t xml:space="preserve">— number of the four published datasets (0–4) in which this site</w:t>
+      </w:r>
+      <w:r>
+        <w:t xml:space="preserve"> </w:t>
+      </w:r>
+      <w:r>
+        <w:t xml:space="preserve">appears;</w:t>
+      </w:r>
+      <w:r>
+        <w:t xml:space="preserve"> </w:t>
+      </w:r>
+      <w:r>
+        <w:rPr>
+          <w:i/>
+          <w:iCs/>
+        </w:rPr>
+        <w:t xml:space="preserve">category</w:t>
+      </w:r>
+      <w:r>
+        <w:t xml:space="preserve"> </w:t>
+      </w:r>
+      <w:r>
+        <w:t xml:space="preserve">— consensus (≥2 published datasets), shared (1 published</w:t>
+      </w:r>
+      <w:r>
+        <w:t xml:space="preserve"> </w:t>
+      </w:r>
+      <w:r>
+        <w:t xml:space="preserve">dataset), or novel_this_study (0 published datasets). 10 rows.</w:t>
       </w:r>
     </w:p>
     <w:bookmarkEnd w:id="9"/>

</xml_diff>